<commit_message>
Publicación en Vercel, base de datos Supabase (hogares, listas, cuentas claras) y correos vía VentuPlay; tema claro por defecto
Co-Authored-By: Claude Opus 5.5 <noreply@anthropic.com>
</commit_message>
<xml_diff>
--- a/docs/Plan AlgoFalta.docx
+++ b/docs/Plan AlgoFalta.docx
@@ -458,6 +458,42 @@
         <w:rPr>
           <w:b/>
         </w:rPr>
+        <w:t>Comprar en varias tiendas:</w:t>
+      </w:r>
+      <w:r>
+        <w:t xml:space="preserve"> cada producto muestra su precio en cada supermercado; la app sugiere dónde sale más barato y cada quien elige. La lista se puede ver por supermercado, asignar quién va a cada uno y, con "Estoy aquí", ver solo lo que toca comprar en esa tienda.</w:t>
+      </w:r>
+    </w:p>
+    <w:p>
+      <w:pPr>
+        <w:pStyle w:val="ListParagraph"/>
+        <w:numPr>
+          <w:ilvl w:val="0"/>
+          <w:numId w:val="3"/>
+        </w:numPr>
+      </w:pPr>
+      <w:r>
+        <w:rPr>
+          <w:b/>
+        </w:rPr>
+        <w:t>Imprevistos en la tienda:</w:t>
+      </w:r>
+      <w:r>
+        <w:t xml:space="preserve"> si el producto no estaba o el precio era otro, se marca desde la lista: "no había" (pasarlo a otra tienda, dejarlo pendiente o quitarlo) u "otro precio" (se corrige y queda registrado para todos).</w:t>
+      </w:r>
+    </w:p>
+    <w:p>
+      <w:pPr>
+        <w:pStyle w:val="ListParagraph"/>
+        <w:numPr>
+          <w:ilvl w:val="0"/>
+          <w:numId w:val="3"/>
+        </w:numPr>
+      </w:pPr>
+      <w:r>
+        <w:rPr>
+          <w:b/>
+        </w:rPr>
         <w:t xml:space="preserve">Notificaciones:</w:t>
       </w:r>
       <w:r>
@@ -542,6 +578,24 @@
       </w:r>
       <w:r>
         <w:t xml:space="preserve"> comparación de la lista completa entre supermercados.</w:t>
+      </w:r>
+    </w:p>
+    <w:p>
+      <w:pPr>
+        <w:pStyle w:val="ListParagraph"/>
+        <w:numPr>
+          <w:ilvl w:val="0"/>
+          <w:numId w:val="4"/>
+        </w:numPr>
+      </w:pPr>
+      <w:r>
+        <w:rPr>
+          <w:b/>
+        </w:rPr>
+        <w:t>Escanear la factura:</w:t>
+      </w:r>
+      <w:r>
+        <w:t xml:space="preserve"> después de comprar, una foto a la factura (o la factura electrónica) y la IA cruza lo comprado con la lista: marca lo que se compró con el precio real, deja pendiente lo que faltó y propone agregar lo que se compró sin estar en la lista. La compra queda registrada en Cuentas claras a nombre de quien pagó. Consume créditos de IA (lectura de imagen), así que va con tope mensual por plan.</w:t>
       </w:r>
     </w:p>
     <w:p>
@@ -1617,7 +1671,7 @@
               <w:t xml:space="preserve">bot en WhatsApp</w:t>
             </w:r>
             <w:r>
-              <w:t xml:space="preserve"> con voz, presupuesto, comparar la lista completa, mercado recurrente</w:t>
+              <w:t xml:space="preserve"> con voz, presupuesto, comparar la lista completa, mercado recurrente, escanear facturas</w:t>
             </w:r>
           </w:p>
         </w:tc>
@@ -1672,7 +1726,7 @@
               <w:t xml:space="preserve">bot en grupos</w:t>
             </w:r>
             <w:r>
-              <w:t xml:space="preserve">, roles y aprobaciones, proyectos, proveedores</w:t>
+              <w:t>, roles y aprobaciones, proyectos, proveedores, escanear facturas</w:t>
             </w:r>
           </w:p>
         </w:tc>
@@ -1727,7 +1781,7 @@
               <w:t xml:space="preserve">bot en grupos</w:t>
             </w:r>
             <w:r>
-              <w:t xml:space="preserve">, varias sedes u obras, stock mínimo, reportes y exportación</w:t>
+              <w:t>, varias sedes u obras, stock mínimo, reportes y exportación, escanear facturas</w:t>
             </w:r>
           </w:p>
         </w:tc>
@@ -2139,6 +2193,24 @@
       </w:r>
       <w:r>
         <w:t xml:space="preserve"> empezar con catálogo sin precio o con precios reportados por los usuarios, y sumar precios automáticos cadena por cadena.</w:t>
+      </w:r>
+    </w:p>
+    <w:p>
+      <w:pPr>
+        <w:pStyle w:val="ListParagraph"/>
+        <w:numPr>
+          <w:ilvl w:val="0"/>
+          <w:numId w:val="13"/>
+        </w:numPr>
+      </w:pPr>
+      <w:r>
+        <w:rPr>
+          <w:b/>
+        </w:rPr>
+        <w:t>Precios reales de los usuarios:</w:t>
+      </w:r>
+      <w:r>
+        <w:t xml:space="preserve"> cada factura escaneada y cada "otro precio" reportado actualizan el precio de referencia de ese producto en esa tienda. Con el uso, el catálogo se vuelve más exacto que cualquier extracción y es un activo propio de AlgoFalta.</w:t>
       </w:r>
     </w:p>
     <w:p>

</xml_diff>